<commit_message>
fix(sidang, report): enhance report generation logic by refining prodi filtering and improving data retrieval for KPPS and voting status in views
</commit_message>
<xml_diff>
--- a/template/SK-4/ba SK IV TEMPLATE.docx
+++ b/template/SK-4/ba SK IV TEMPLATE.docx
@@ -977,21 +977,21 @@
                 <w:color w:val="000000" w:themeColor="text1"/>
                 <w:lang w:val="en-US"/>
               </w:rPr>
-              <w:t>$(</w:t>
+              <w:t>${nilai_1}</w:t>
             </w:r>
             <w:r>
               <w:rPr>
                 <w:color w:val="000000" w:themeColor="text1"/>
                 <w:lang w:val="en-US"/>
               </w:rPr>
-              <w:t>Nilai rata2</w:t>
+              <w:t/>
             </w:r>
             <w:r>
               <w:rPr>
                 <w:color w:val="000000" w:themeColor="text1"/>
                 <w:lang w:val="en-US"/>
               </w:rPr>
-              <w:t>)</w:t>
+              <w:t/>
             </w:r>
           </w:p>
         </w:tc>
@@ -1112,21 +1112,21 @@
                 <w:color w:val="000000" w:themeColor="text1"/>
                 <w:lang w:val="en-US"/>
               </w:rPr>
-              <w:t>$(</w:t>
+              <w:t>${nilai_2}</w:t>
             </w:r>
             <w:r>
               <w:rPr>
                 <w:color w:val="000000" w:themeColor="text1"/>
                 <w:lang w:val="en-US"/>
               </w:rPr>
-              <w:t>Nilai rata2</w:t>
+              <w:t/>
             </w:r>
             <w:r>
               <w:rPr>
                 <w:color w:val="000000" w:themeColor="text1"/>
                 <w:lang w:val="en-US"/>
               </w:rPr>
-              <w:t>)</w:t>
+              <w:t/>
             </w:r>
           </w:p>
         </w:tc>
@@ -1236,21 +1236,21 @@
                 <w:color w:val="000000" w:themeColor="text1"/>
                 <w:lang w:val="en-US"/>
               </w:rPr>
-              <w:t>$(</w:t>
+              <w:t>${nilai_3}</w:t>
             </w:r>
             <w:r>
               <w:rPr>
                 <w:color w:val="000000" w:themeColor="text1"/>
                 <w:lang w:val="en-US"/>
               </w:rPr>
-              <w:t>Nilai rata2</w:t>
+              <w:t/>
             </w:r>
             <w:r>
               <w:rPr>
                 <w:color w:val="000000" w:themeColor="text1"/>
                 <w:lang w:val="en-US"/>
               </w:rPr>
-              <w:t>)</w:t>
+              <w:t/>
             </w:r>
           </w:p>
         </w:tc>
@@ -1374,21 +1374,21 @@
                 <w:color w:val="000000" w:themeColor="text1"/>
                 <w:lang w:val="en-US"/>
               </w:rPr>
-              <w:t>$(</w:t>
+              <w:t>${nilai_4}</w:t>
             </w:r>
             <w:r>
               <w:rPr>
                 <w:color w:val="000000" w:themeColor="text1"/>
                 <w:lang w:val="en-US"/>
               </w:rPr>
-              <w:t>Nilai rata2</w:t>
+              <w:t/>
             </w:r>
             <w:r>
               <w:rPr>
                 <w:color w:val="000000" w:themeColor="text1"/>
                 <w:lang w:val="en-US"/>
               </w:rPr>
-              <w:t>)</w:t>
+              <w:t/>
             </w:r>
           </w:p>
         </w:tc>
@@ -1512,21 +1512,21 @@
                 <w:color w:val="000000" w:themeColor="text1"/>
                 <w:lang w:val="en-US"/>
               </w:rPr>
-              <w:t>$(</w:t>
+              <w:t>${nilai_5}</w:t>
             </w:r>
             <w:r>
               <w:rPr>
                 <w:color w:val="000000" w:themeColor="text1"/>
                 <w:lang w:val="en-US"/>
               </w:rPr>
-              <w:t>Nilai rata2</w:t>
+              <w:t/>
             </w:r>
             <w:r>
               <w:rPr>
                 <w:color w:val="000000" w:themeColor="text1"/>
                 <w:lang w:val="en-US"/>
               </w:rPr>
-              <w:t>)</w:t>
+              <w:t/>
             </w:r>
           </w:p>
         </w:tc>
@@ -1654,21 +1654,21 @@
                 <w:color w:val="000000" w:themeColor="text1"/>
                 <w:lang w:val="en-US"/>
               </w:rPr>
-              <w:t>$(</w:t>
+              <w:t>${nilai_6}</w:t>
             </w:r>
             <w:r>
               <w:rPr>
                 <w:color w:val="000000" w:themeColor="text1"/>
                 <w:lang w:val="en-US"/>
               </w:rPr>
-              <w:t>Nilai rata2</w:t>
+              <w:t/>
             </w:r>
             <w:r>
               <w:rPr>
                 <w:color w:val="000000" w:themeColor="text1"/>
                 <w:lang w:val="en-US"/>
               </w:rPr>
-              <w:t>)</w:t>
+              <w:t/>
             </w:r>
           </w:p>
         </w:tc>

</xml_diff>